<commit_message>
Correct MITRE ATLAS IDs and OWASP mapping in report template
AML.T0031, T0056, T0024 and T0019 had the wrong technique names, system prompt
extraction maps to LLM07 in the 2025 list, and the coverage matrix no longer
pre-marks techniques as tested.

Co-Authored-By: Claude Sonnet 5.5 <noreply@anthropic.com>
Claude-Session: https://claude.ai/code/session_014Udgj5Aw5TF8mxXT8knYXD
</commit_message>
<xml_diff>
--- a/AI_RedTeam_Report_Template.docx
+++ b/AI_RedTeam_Report_Template.docx
@@ -1692,7 +1692,7 @@
                 <w:rFonts w:ascii="Calibri" w:hAnsi="Calibri"/>
                 <w:sz w:val="18"/>
               </w:rPr>
-              <w:t>LLM01 / LLM06</w:t>
+              <w:t>LLM01 / LLM07</w:t>
             </w:r>
           </w:p>
         </w:tc>
@@ -1723,7 +1723,7 @@
                 <w:rFonts w:ascii="Calibri" w:hAnsi="Calibri"/>
                 <w:sz w:val="18"/>
               </w:rPr>
-              <w:t>AML.T0051 / AML.T0048</w:t>
+              <w:t>AML.T0051.001 / AML.T0056</w:t>
             </w:r>
           </w:p>
         </w:tc>
@@ -2043,7 +2043,7 @@
                 <w:rFonts w:ascii="Calibri" w:hAnsi="Calibri"/>
                 <w:sz w:val="18"/>
               </w:rPr>
-              <w:t>AML.T0051</w:t>
+              <w:t>AML.T0054</w:t>
             </w:r>
           </w:p>
         </w:tc>
@@ -2864,7 +2864,7 @@
                 <w:rFonts w:ascii="Calibri" w:hAnsi="Calibri"/>
                 <w:sz w:val="18"/>
               </w:rPr>
-              <w:t>✓</w:t>
+              <w:t>[ ]</w:t>
             </w:r>
           </w:p>
         </w:tc>
@@ -2909,7 +2909,7 @@
                 <w:rFonts w:ascii="Calibri" w:hAnsi="Calibri"/>
                 <w:sz w:val="18"/>
               </w:rPr>
-              <w:t>Societal Harm / Unfair Outcomes</w:t>
+              <w:t>External Harms</w:t>
             </w:r>
           </w:p>
         </w:tc>
@@ -2923,7 +2923,7 @@
                 <w:rFonts w:ascii="Calibri" w:hAnsi="Calibri"/>
                 <w:sz w:val="18"/>
               </w:rPr>
-              <w:t>✓</w:t>
+              <w:t>[ ]</w:t>
             </w:r>
           </w:p>
         </w:tc>
@@ -2968,7 +2968,7 @@
                 <w:rFonts w:ascii="Calibri" w:hAnsi="Calibri"/>
                 <w:sz w:val="18"/>
               </w:rPr>
-              <w:t>Adversarial Patch / Evasion</w:t>
+              <w:t>Erode AI Model Integrity</w:t>
             </w:r>
           </w:p>
         </w:tc>
@@ -2982,7 +2982,7 @@
                 <w:rFonts w:ascii="Calibri" w:hAnsi="Calibri"/>
                 <w:sz w:val="18"/>
               </w:rPr>
-              <w:t>✓</w:t>
+              <w:t>[ ]</w:t>
             </w:r>
           </w:p>
         </w:tc>
@@ -3027,7 +3027,7 @@
                 <w:rFonts w:ascii="Calibri" w:hAnsi="Calibri"/>
                 <w:sz w:val="18"/>
               </w:rPr>
-              <w:t>Steal ML Model</w:t>
+              <w:t>Extract LLM System Prompt</w:t>
             </w:r>
           </w:p>
         </w:tc>
@@ -3041,7 +3041,7 @@
                 <w:rFonts w:ascii="Calibri" w:hAnsi="Calibri"/>
                 <w:sz w:val="18"/>
               </w:rPr>
-              <w:t>✓</w:t>
+              <w:t>[ ]</w:t>
             </w:r>
           </w:p>
         </w:tc>
@@ -3086,7 +3086,7 @@
                 <w:rFonts w:ascii="Calibri" w:hAnsi="Calibri"/>
                 <w:sz w:val="18"/>
               </w:rPr>
-              <w:t>Exfiltrate Training Data</w:t>
+              <w:t>Exfiltration via AI Inference API</w:t>
             </w:r>
           </w:p>
         </w:tc>
@@ -3100,7 +3100,7 @@
                 <w:rFonts w:ascii="Calibri" w:hAnsi="Calibri"/>
                 <w:sz w:val="18"/>
               </w:rPr>
-              <w:t>✓</w:t>
+              <w:t>[ ]</w:t>
             </w:r>
           </w:p>
         </w:tc>
@@ -3145,7 +3145,7 @@
                 <w:rFonts w:ascii="Calibri" w:hAnsi="Calibri"/>
                 <w:sz w:val="18"/>
               </w:rPr>
-              <w:t>Backdoor ML Model</w:t>
+              <w:t>Publish Poisoned Datasets</w:t>
             </w:r>
           </w:p>
         </w:tc>

</xml_diff>